<commit_message>
Strategic Monthly Discount: Raffia rate and MCQ (GAIL DVR test 27.10.2026)
- Raffia-sector MPGs (Rs. 4000) now read from the material master for
  materials W50*/T50*/Y50*/E36*/E24* (sales org 5000). RANGE_R from
  YRVA_PRS_GRADES was empty in DVR and an empty range matches every
  value, so every grade was priced at Rs. 4000.
- MCQ / Committed Qty and MCQ % filled (run month MCQ, else the monthly
  MCQ of the first CIS month).
- Test document updated accordingly.

Co-Authored-By: Claude Opus 5.5 <noreply@anthropic.com>
Claude-Session: https://claude.ai/code/session_01A3BJ7ydDq6e8VDbD1uvXUk
</commit_message>
<xml_diff>
--- a/CIS_2026-27_Strategic_Monthly_Discount_Maintain_and_Test.docx
+++ b/CIS_2026-27_Strategic_Monthly_Discount_Maintain_and_Test.docx
@@ -473,7 +473,7 @@
                 <w:sz w:val="20"/>
                 <w:szCs w:val="20"/>
               </w:rPr>
-              <w:t>YRVA_PRS_GRADES</w:t>
+              <w:t>Material master (MVKE, sales org 5000)</w:t>
             </w:r>
           </w:p>
         </w:tc>
@@ -494,7 +494,7 @@
                 <w:sz w:val="20"/>
                 <w:szCs w:val="20"/>
               </w:rPr>
-              <w:t>The Raffia-sector grades W50, T50, Y50, E36, E24 must be present with indicator = 'R'</w:t>
+              <w:t>The Raffia-sector materials W50*, T50*, Y50*, E36*, E24* (e.g. W50A009A/B/OG, T50A010A/B/OG, Y50A010U A/B/OG, E36A060A/B/OG, E24A070U A/B/OG) must carry their Material Pricing Group (MPG, e.g. 22, 66, J6/J7, 7/D0, Y3/Y4)</w:t>
             </w:r>
           </w:p>
         </w:tc>
@@ -515,7 +515,7 @@
                 <w:sz w:val="20"/>
                 <w:szCs w:val="20"/>
               </w:rPr>
-              <w:t>These get Rs. 4000/MT. If a Raffia grade is missing or not 'R', it is charged at Rs. 3000/MT instead.</w:t>
+              <w:t>The system reads the MPGs of these materials and values their lifting at Rs. 4000/MT; every other HDPE/LLDPE MPG gets Rs. 3000/MT. YRVA_PRS_GRADES is no longer used for this discount.</w:t>
             </w:r>
           </w:p>
         </w:tc>
@@ -1641,6 +1641,54 @@
           </w:p>
         </w:tc>
       </w:tr>
+      <w:tr>
+        <w:tblPrEx>
+          <w:tblCellMar>
+            <w:top w:w="0" w:type="dxa"/>
+            <w:bottom w:w="0" w:type="dxa"/>
+          </w:tblCellMar>
+        </w:tblPrEx>
+        <w:tc>
+          <w:tcPr>
+            <w:tcW w:w="3250" w:type="dxa"/>
+            <w:tcMar>
+              <w:top w:w="55" w:type="dxa"/>
+              <w:left w:w="95" w:type="dxa"/>
+              <w:bottom w:w="55" w:type="dxa"/>
+              <w:right w:w="95" w:type="dxa"/>
+            </w:tcMar>
+          </w:tcPr>
+          <w:p>
+            <w:r>
+              <w:rPr>
+                <w:sz w:val="20"/>
+                <w:szCs w:val="20"/>
+              </w:rPr>
+              <w:t>MCQ / MCQ %</w:t>
+            </w:r>
+          </w:p>
+        </w:tc>
+        <w:tc>
+          <w:tcPr>
+            <w:tcW w:w="6470" w:type="dxa"/>
+            <w:tcMar>
+              <w:top w:w="55" w:type="dxa"/>
+              <w:left w:w="95" w:type="dxa"/>
+              <w:bottom w:w="55" w:type="dxa"/>
+              <w:right w:w="95" w:type="dxa"/>
+            </w:tcMar>
+          </w:tcPr>
+          <w:p>
+            <w:r>
+              <w:rPr>
+                <w:sz w:val="20"/>
+                <w:szCs w:val="20"/>
+              </w:rPr>
+              <w:t>MCQ / Committed Qty = the customer's committed qty for the run month; if the month is before the customer's CIS start (customers join in Jun/Jul 2026), the monthly MCQ of the first CIS month is shown. MCQ % = lifted qty / MCQ.</w:t>
+            </w:r>
+          </w:p>
+        </w:tc>
+      </w:tr>
     </w:tbl>
     <w:p>
       <w:pPr>
@@ -1668,7 +1716,7 @@
           <w:sz w:val="20"/>
           <w:szCs w:val="20"/>
         </w:rPr>
-        <w:t>if an eligible customer shows zero, check (1) their MoU dates in YRVA_QAIS_DATA, (2) that their grades are listed in YRVA_HDPE_GRADES / YRVA_LLDPE_GRADE, and (3) that lifting exists in S922 for the month. For a wrong rate, check the Raffia 'R' flag in YRVA_PRS_GRADES.</w:t>
+        <w:t>if an eligible customer shows zero, check (1) their MoU dates in YRVA_QAIS_DATA, (2) that their grades are listed in YRVA_HDPE_GRADES / YRVA_LLDPE_GRADE, and (3) that lifting exists in S922 for the month. For a wrong rate, check the Material Pricing Group of the material in the material master (sales org 5000).</w:t>
       </w:r>
     </w:p>
     <w:p>

</xml_diff>

<commit_message>
Strategic Monthly Discount: Raffia MPG list per GAIL, all PE grades counted
- Raffia MPGs (Rs. 4000) = GAIL list Y3, Y4, 07, D0, 66, G1, 22, A8, J6,
  J7 (the material-master prefix lookup also caught MPG 03)
- applicable grades = HDPE + LLDPE + YRVA_OTHER_GRADE + YRVA_OTHER_GRAD1
  (MPG 11 was not counted - Dhanashree May'26 54 MT instead of 56 MT)
- test document updated

Co-Authored-By: Claude Opus 5.5 <noreply@anthropic.com>
Claude-Session: https://claude.ai/code/session_01A3BJ7ydDq6e8VDbD1uvXUk
</commit_message>
<xml_diff>
--- a/CIS_2026-27_Strategic_Monthly_Discount_Maintain_and_Test.docx
+++ b/CIS_2026-27_Strategic_Monthly_Discount_Maintain_and_Test.docx
@@ -473,7 +473,7 @@
                 <w:sz w:val="20"/>
                 <w:szCs w:val="20"/>
               </w:rPr>
-              <w:t>Material master (MVKE, sales org 5000)</w:t>
+              <w:t>Raffia MPGs (in the program)</w:t>
             </w:r>
           </w:p>
         </w:tc>
@@ -494,7 +494,7 @@
                 <w:sz w:val="20"/>
                 <w:szCs w:val="20"/>
               </w:rPr>
-              <w:t>The Raffia-sector materials W50*, T50*, Y50*, E36*, E24* (e.g. W50A009A/B/OG, T50A010A/B/OG, Y50A010U A/B/OG, E36A060A/B/OG, E24A070U A/B/OG) must carry their Material Pricing Group (MPG, e.g. 22, 66, J6/J7, 7/D0, Y3/Y4)</w:t>
+              <w:t>Raffia-sector grades as per GAIL list: E24A070U A/B (Y3), E24A070U OG (Y4), E36A060A/B (07), E36A060OG (D0), T50A010A/B (66), T50A010OG (G1), W50A009A/B (22), W50A009OG (A8), Y50A010U A/B (J6), Y50A010U OG (J7). The materials must carry these Material Pricing Groups (MPG) in the material master.</w:t>
             </w:r>
           </w:p>
         </w:tc>
@@ -515,7 +515,7 @@
                 <w:sz w:val="20"/>
                 <w:szCs w:val="20"/>
               </w:rPr>
-              <w:t>The system reads the MPGs of these materials and values their lifting at Rs. 4000/MT; every other HDPE/LLDPE MPG gets Rs. 3000/MT. YRVA_PRS_GRADES is no longer used for this discount.</w:t>
+              <w:t>Lifting in these MPGs is valued at Rs. 4000/MT; every other HDPE/LLDPE MPG gets Rs. 3000/MT. YRVA_PRS_GRADES is not used for this discount.</w:t>
             </w:r>
           </w:p>
         </w:tc>
@@ -563,7 +563,7 @@
                 <w:sz w:val="20"/>
                 <w:szCs w:val="20"/>
               </w:rPr>
-              <w:t>Complete list of HDPE grades (KONDM)</w:t>
+              <w:t>Complete list of HDPE grades (KONDM); other PE grades in YRVA_OTHER_GRADE / YRVA_OTHER_GRAD1</w:t>
             </w:r>
           </w:p>
         </w:tc>
@@ -583,7 +583,7 @@
                 <w:sz w:val="20"/>
                 <w:szCs w:val="20"/>
               </w:rPr>
-              <w:t>Only grades listed here (+ LLDPE) are counted. A missing grade's lifting is ignored.</w:t>
+              <w:t>Only grades listed in YRVA_HDPE_GRADES, YRVA_LLDPE_GRADE, YRVA_OTHER_GRADE or YRVA_OTHER_GRAD1 are counted. A missing grade's lifting is ignored.</w:t>
             </w:r>
           </w:p>
         </w:tc>
@@ -1716,7 +1716,7 @@
           <w:sz w:val="20"/>
           <w:szCs w:val="20"/>
         </w:rPr>
-        <w:t>if an eligible customer shows zero, check (1) their MoU dates in YRVA_QAIS_DATA, (2) that their grades are listed in YRVA_HDPE_GRADES / YRVA_LLDPE_GRADE, and (3) that lifting exists in S922 for the month. For a wrong rate, check the Material Pricing Group of the material in the material master (sales org 5000).</w:t>
+        <w:t>if an eligible customer shows zero, check (1) their MoU dates in YRVA_QAIS_DATA, (2) that their grades are listed in YRVA_HDPE_GRADES / YRVA_LLDPE_GRADE, and (3) that lifting exists in S922 for the month. For a wrong rate, check the Material Pricing Group of the material against the Raffia MPG list above.</w:t>
       </w:r>
     </w:p>
     <w:p>

</xml_diff>